<commit_message>
Add benchmarking script and enhance result plotting
- Introduced `run_benchmark.py` to execute a multi-sentence TTS benchmark across various engines, generating a manifest for evaluation.
- Updated `plot_results.py` to improve visualization of evaluation results, including mean and standard deviation for WER and CER, and added a distribution plot for WER per sentence.
- Refactored data loading and statistics calculation for better clarity and efficiency.
- Enhanced plotting functions to accommodate new statistical data and improve visual representation.
</commit_message>
<xml_diff>
--- a/docs/DSP391m_Report3_Model_and_Results.docx
+++ b/docs/DSP391m_Report3_Model_and_Results.docx
@@ -43,17 +43,194 @@
         <w:t>Report 3 — Model Development · Evaluation &amp; Fine-Tuning · Results · Conclusion</w:t>
       </w:r>
     </w:p>
-    <w:p>
-      <w:pPr>
+    <w:p/>
+    <w:tbl>
+      <w:tblPr>
+        <w:tblStyle w:val="TableGrid"/>
+        <w:tblW w:type="auto" w:w="0"/>
         <w:jc w:val="center"/>
-      </w:pPr>
-      <w:r>
-        <w:rPr>
-          <w:sz w:val="22"/>
-        </w:rPr>
-        <w:t>Group 4 · FPT University · Summer 2026</w:t>
-      </w:r>
-    </w:p>
+        <w:tblLayout w:type="fixed"/>
+        <w:tblLook w:firstColumn="1" w:firstRow="1" w:lastColumn="0" w:lastRow="0" w:noHBand="0" w:noVBand="1" w:val="04A0"/>
+      </w:tblPr>
+      <w:tblGrid>
+        <w:gridCol w:w="4680"/>
+        <w:gridCol w:w="4680"/>
+      </w:tblGrid>
+      <w:tr>
+        <w:tc>
+          <w:tcPr>
+            <w:tcW w:type="dxa" w:w="2736"/>
+            <w:vAlign w:val="center"/>
+          </w:tcPr>
+          <w:p>
+            <w:pPr>
+              <w:spacing w:after="40"/>
+            </w:pPr>
+            <w:r/>
+            <w:r>
+              <w:rPr>
+                <w:sz w:val="23"/>
+              </w:rPr>
+              <w:t>Course:</w:t>
+            </w:r>
+          </w:p>
+        </w:tc>
+        <w:tc>
+          <w:tcPr>
+            <w:tcW w:type="dxa" w:w="6336"/>
+            <w:vAlign w:val="center"/>
+          </w:tcPr>
+          <w:p>
+            <w:pPr>
+              <w:spacing w:after="40"/>
+            </w:pPr>
+            <w:r/>
+            <w:r>
+              <w:rPr>
+                <w:sz w:val="23"/>
+              </w:rPr>
+              <w:t>DSP391m - Data Science Capstone Project</w:t>
+            </w:r>
+          </w:p>
+        </w:tc>
+      </w:tr>
+      <w:tr>
+        <w:tc>
+          <w:tcPr>
+            <w:tcW w:type="dxa" w:w="2736"/>
+            <w:vAlign w:val="center"/>
+          </w:tcPr>
+          <w:p>
+            <w:pPr>
+              <w:spacing w:after="40"/>
+            </w:pPr>
+            <w:r/>
+            <w:r>
+              <w:rPr>
+                <w:sz w:val="23"/>
+              </w:rPr>
+              <w:t>Team Members:</w:t>
+            </w:r>
+          </w:p>
+        </w:tc>
+        <w:tc>
+          <w:tcPr>
+            <w:tcW w:type="dxa" w:w="6336"/>
+            <w:vAlign w:val="center"/>
+          </w:tcPr>
+          <w:p>
+            <w:pPr>
+              <w:spacing w:after="40"/>
+            </w:pPr>
+            <w:r/>
+            <w:r>
+              <w:rPr>
+                <w:sz w:val="23"/>
+              </w:rPr>
+              <w:t>Nguyễn Hoàng Thanh - SE172535</w:t>
+            </w:r>
+          </w:p>
+          <w:p>
+            <w:pPr>
+              <w:spacing w:after="40"/>
+            </w:pPr>
+            <w:r>
+              <w:rPr>
+                <w:sz w:val="23"/>
+              </w:rPr>
+              <w:t>Trương Thanh Tuấn - SE182217</w:t>
+            </w:r>
+          </w:p>
+          <w:p>
+            <w:pPr>
+              <w:spacing w:after="40"/>
+            </w:pPr>
+            <w:r>
+              <w:rPr>
+                <w:sz w:val="23"/>
+              </w:rPr>
+              <w:t>Nguyễn Thị Vân Anh - DE18037</w:t>
+            </w:r>
+          </w:p>
+        </w:tc>
+      </w:tr>
+      <w:tr>
+        <w:tc>
+          <w:tcPr>
+            <w:tcW w:type="dxa" w:w="2736"/>
+            <w:vAlign w:val="center"/>
+          </w:tcPr>
+          <w:p>
+            <w:pPr>
+              <w:spacing w:after="40"/>
+            </w:pPr>
+            <w:r/>
+            <w:r>
+              <w:rPr>
+                <w:sz w:val="23"/>
+              </w:rPr>
+              <w:t>Instructor:</w:t>
+            </w:r>
+          </w:p>
+        </w:tc>
+        <w:tc>
+          <w:tcPr>
+            <w:tcW w:type="dxa" w:w="6336"/>
+            <w:vAlign w:val="center"/>
+          </w:tcPr>
+          <w:p>
+            <w:pPr>
+              <w:spacing w:after="40"/>
+            </w:pPr>
+            <w:r/>
+            <w:r>
+              <w:rPr>
+                <w:sz w:val="23"/>
+              </w:rPr>
+              <w:t>Nguyễn Quốc Trung</w:t>
+            </w:r>
+          </w:p>
+        </w:tc>
+      </w:tr>
+      <w:tr>
+        <w:tc>
+          <w:tcPr>
+            <w:tcW w:type="dxa" w:w="2736"/>
+            <w:vAlign w:val="center"/>
+          </w:tcPr>
+          <w:p>
+            <w:pPr>
+              <w:spacing w:after="40"/>
+            </w:pPr>
+            <w:r/>
+            <w:r>
+              <w:rPr>
+                <w:sz w:val="23"/>
+              </w:rPr>
+              <w:t>Academic Term:</w:t>
+            </w:r>
+          </w:p>
+        </w:tc>
+        <w:tc>
+          <w:tcPr>
+            <w:tcW w:type="dxa" w:w="6336"/>
+            <w:vAlign w:val="center"/>
+          </w:tcPr>
+          <w:p>
+            <w:pPr>
+              <w:spacing w:after="40"/>
+            </w:pPr>
+            <w:r/>
+            <w:r>
+              <w:rPr>
+                <w:sz w:val="23"/>
+              </w:rPr>
+              <w:t>Summer 2026</w:t>
+            </w:r>
+          </w:p>
+        </w:tc>
+      </w:tr>
+    </w:tbl>
     <w:p/>
     <w:p>
       <w:pPr>
@@ -74,273 +251,6 @@
         <w:t>Vietnamese Voice Cloning Studio — a bilingual web application that clones a Vietnamese speaker's voice from a short reference recording using F5-TTS, and benchmarks it against five additional text-to-speech engines under identical inputs with an objective, reproducible evaluation harness.</w:t>
       </w:r>
     </w:p>
-    <w:p>
-      <w:pPr>
-        <w:pStyle w:val="Heading1"/>
-      </w:pPr>
-      <w:r>
-        <w:t>Team Members</w:t>
-      </w:r>
-    </w:p>
-    <w:p>
-      <w:pPr>
-        <w:jc w:val="both"/>
-      </w:pPr>
-      <w:r>
-        <w:rPr>
-          <w:i/>
-          <w:color w:val="5B6778"/>
-        </w:rPr>
-        <w:t>Group 4, DSP391m. Please complete the table below with each member's full name (first, then last) and role before submission.</w:t>
-      </w:r>
-    </w:p>
-    <w:tbl>
-      <w:tblPr>
-        <w:tblStyle w:val="LightGrid-Accent1"/>
-        <w:tblW w:type="auto" w:w="0"/>
-        <w:jc w:val="center"/>
-        <w:tblLook w:firstColumn="1" w:firstRow="1" w:lastColumn="0" w:lastRow="0" w:noHBand="0" w:noVBand="1" w:val="04A0"/>
-      </w:tblPr>
-      <w:tblGrid>
-        <w:gridCol w:w="3120"/>
-        <w:gridCol w:w="3120"/>
-        <w:gridCol w:w="3120"/>
-      </w:tblGrid>
-      <w:tr>
-        <w:tc>
-          <w:tcPr>
-            <w:tcW w:type="dxa" w:w="3120"/>
-            <w:shd w:val="clear" w:fill="1B4965"/>
-          </w:tcPr>
-          <w:p>
-            <w:pPr>
-              <w:jc w:val="left"/>
-            </w:pPr>
-            <w:r/>
-            <w:r>
-              <w:rPr>
-                <w:b/>
-                <w:color w:val="FFFFFF"/>
-                <w:sz w:val="21"/>
-              </w:rPr>
-              <w:t>No.</w:t>
-            </w:r>
-          </w:p>
-        </w:tc>
-        <w:tc>
-          <w:tcPr>
-            <w:tcW w:type="dxa" w:w="3120"/>
-            <w:shd w:val="clear" w:fill="1B4965"/>
-          </w:tcPr>
-          <w:p>
-            <w:pPr>
-              <w:jc w:val="left"/>
-            </w:pPr>
-            <w:r/>
-            <w:r>
-              <w:rPr>
-                <w:b/>
-                <w:color w:val="FFFFFF"/>
-                <w:sz w:val="21"/>
-              </w:rPr>
-              <w:t>Full name</w:t>
-            </w:r>
-          </w:p>
-        </w:tc>
-        <w:tc>
-          <w:tcPr>
-            <w:tcW w:type="dxa" w:w="3120"/>
-            <w:shd w:val="clear" w:fill="1B4965"/>
-          </w:tcPr>
-          <w:p>
-            <w:pPr>
-              <w:jc w:val="left"/>
-            </w:pPr>
-            <w:r/>
-            <w:r>
-              <w:rPr>
-                <w:b/>
-                <w:color w:val="FFFFFF"/>
-                <w:sz w:val="21"/>
-              </w:rPr>
-              <w:t>Role / responsibility</w:t>
-            </w:r>
-          </w:p>
-        </w:tc>
-      </w:tr>
-      <w:tr>
-        <w:tc>
-          <w:tcPr>
-            <w:tcW w:type="dxa" w:w="3120"/>
-          </w:tcPr>
-          <w:p>
-            <w:pPr>
-              <w:jc w:val="left"/>
-            </w:pPr>
-            <w:r/>
-            <w:r>
-              <w:rPr>
-                <w:b w:val="0"/>
-                <w:sz w:val="21"/>
-              </w:rPr>
-              <w:t>1</w:t>
-            </w:r>
-          </w:p>
-        </w:tc>
-        <w:tc>
-          <w:tcPr>
-            <w:tcW w:type="dxa" w:w="3120"/>
-          </w:tcPr>
-          <w:p>
-            <w:pPr>
-              <w:jc w:val="left"/>
-            </w:pPr>
-            <w:r/>
-            <w:r>
-              <w:rPr>
-                <w:b w:val="0"/>
-                <w:color w:val="5B6778"/>
-                <w:sz w:val="21"/>
-              </w:rPr>
-              <w:t>⟨member name⟩</w:t>
-            </w:r>
-          </w:p>
-        </w:tc>
-        <w:tc>
-          <w:tcPr>
-            <w:tcW w:type="dxa" w:w="3120"/>
-          </w:tcPr>
-          <w:p>
-            <w:pPr>
-              <w:jc w:val="left"/>
-            </w:pPr>
-            <w:r/>
-            <w:r>
-              <w:rPr>
-                <w:b w:val="0"/>
-                <w:sz w:val="21"/>
-              </w:rPr>
-              <w:t>Modeling &amp; inference pipeline</w:t>
-            </w:r>
-          </w:p>
-        </w:tc>
-      </w:tr>
-      <w:tr>
-        <w:tc>
-          <w:tcPr>
-            <w:tcW w:type="dxa" w:w="3120"/>
-          </w:tcPr>
-          <w:p>
-            <w:pPr>
-              <w:jc w:val="left"/>
-            </w:pPr>
-            <w:r/>
-            <w:r>
-              <w:rPr>
-                <w:b w:val="0"/>
-                <w:sz w:val="21"/>
-              </w:rPr>
-              <w:t>2</w:t>
-            </w:r>
-          </w:p>
-        </w:tc>
-        <w:tc>
-          <w:tcPr>
-            <w:tcW w:type="dxa" w:w="3120"/>
-          </w:tcPr>
-          <w:p>
-            <w:pPr>
-              <w:jc w:val="left"/>
-            </w:pPr>
-            <w:r/>
-            <w:r>
-              <w:rPr>
-                <w:b w:val="0"/>
-                <w:color w:val="5B6778"/>
-                <w:sz w:val="21"/>
-              </w:rPr>
-              <w:t>⟨member name⟩</w:t>
-            </w:r>
-          </w:p>
-        </w:tc>
-        <w:tc>
-          <w:tcPr>
-            <w:tcW w:type="dxa" w:w="3120"/>
-          </w:tcPr>
-          <w:p>
-            <w:pPr>
-              <w:jc w:val="left"/>
-            </w:pPr>
-            <w:r/>
-            <w:r>
-              <w:rPr>
-                <w:b w:val="0"/>
-                <w:sz w:val="21"/>
-              </w:rPr>
-              <w:t>Data preparation &amp; fine-tuning</w:t>
-            </w:r>
-          </w:p>
-        </w:tc>
-      </w:tr>
-      <w:tr>
-        <w:tc>
-          <w:tcPr>
-            <w:tcW w:type="dxa" w:w="3120"/>
-          </w:tcPr>
-          <w:p>
-            <w:pPr>
-              <w:jc w:val="left"/>
-            </w:pPr>
-            <w:r/>
-            <w:r>
-              <w:rPr>
-                <w:b w:val="0"/>
-                <w:sz w:val="21"/>
-              </w:rPr>
-              <w:t>3</w:t>
-            </w:r>
-          </w:p>
-        </w:tc>
-        <w:tc>
-          <w:tcPr>
-            <w:tcW w:type="dxa" w:w="3120"/>
-          </w:tcPr>
-          <w:p>
-            <w:pPr>
-              <w:jc w:val="left"/>
-            </w:pPr>
-            <w:r/>
-            <w:r>
-              <w:rPr>
-                <w:b w:val="0"/>
-                <w:color w:val="5B6778"/>
-                <w:sz w:val="21"/>
-              </w:rPr>
-              <w:t>⟨member name⟩</w:t>
-            </w:r>
-          </w:p>
-        </w:tc>
-        <w:tc>
-          <w:tcPr>
-            <w:tcW w:type="dxa" w:w="3120"/>
-          </w:tcPr>
-          <w:p>
-            <w:pPr>
-              <w:jc w:val="left"/>
-            </w:pPr>
-            <w:r/>
-            <w:r>
-              <w:rPr>
-                <w:b w:val="0"/>
-                <w:sz w:val="21"/>
-              </w:rPr>
-              <w:t>Evaluation &amp; visualization</w:t>
-            </w:r>
-          </w:p>
-        </w:tc>
-      </w:tr>
-    </w:tbl>
-    <w:p/>
     <w:p>
       <w:pPr>
         <w:pStyle w:val="Heading1"/>
@@ -745,7 +655,7 @@
           <w:i/>
           <w:color w:val="5B6778"/>
         </w:rPr>
-        <w:t>Honest status: the pipeline is hardened and unit-tested at the component level but has not yet been verified end-to-end on real speaker data with a GPU (blocked by the absence of collected speech). Accordingly, the results in Section 9 characterize the zero-shot base model, not a fine-tuned one; no fine-tuning improvement is claimed.</w:t>
+        <w:t>Honest status: the fine-tuning pipeline is established and verified at the code-path level (its pure components are unit-tested), but it has not yet been run end-to-end on real speaker data with a GPU (blocked by the absence of collected speech). Accordingly, the results in Section 9 characterize the zero-shot base model, not a fine-tuned one; no fine-tuning improvement is claimed.</w:t>
       </w:r>
     </w:p>
     <w:p>
@@ -1327,7 +1237,7 @@
         <w:rPr>
           <w:i w:val="0"/>
         </w:rPr>
-        <w:t>Classical k-fold cross-validation is impractical for fine-tuning a 336M-parameter generative model on tens of minutes of audio (the k× training cost is prohibitive and the signal is generative, not a classification label). Its role is filled by (i) a deterministic held-out validation split monitored every epoch, with the best checkpoint chosen by validation loss, and (ii) an independent fixed test set of diverse sentences — short, numeric, decimal, date, abbreviation, proper-noun, interrogative, compound and long — for post-hoc WER/CER/SECS evaluation.</w:t>
+        <w:t>Classical k-fold cross-validation is impractical for fine-tuning a 336M-parameter generative model on tens of minutes of audio (the k× training cost is prohibitive and the signal is generative, not a classification label). Its role is filled by (i) a deterministic held-out validation split monitored every epoch, with the best checkpoint chosen by validation loss, and (ii) an independent fixed test set of diverse sentences — greeting, general, numeric, date, interrogative, compound and long — used for the post-hoc WER/CER/SECS benchmark in Section 9.</w:t>
       </w:r>
     </w:p>
     <w:p>
@@ -1346,7 +1256,7 @@
         <w:rPr>
           <w:i w:val="0"/>
         </w:rPr>
-        <w:t>All six engines synthesize the same 17-word sentence from the same reference sample under a fixed seed (42). Table 2 reports the objective results (values read directly from outputs/evaluation/results.json); Figures 1–4 visualize them.</w:t>
+        <w:t>Every engine synthesizes the SAME set of 7 diverse Vietnamese sentences (greeting, general, number, date, question, compound and long) from the SAME reference sample under a fixed seed (42) and, for F5-TTS, a fixed NFE (32). Whisper re-transcribes each output; metrics are computed per sentence and aggregated. Because a few hard sentences (numbers, dates) legitimately inflate the average, Table 2 reports WER/CER as median / mean, and Figure 5 shows the full per-sentence spread. Values are read directly from results.json.</w:t>
       </w:r>
     </w:p>
     <w:tbl>
@@ -1357,18 +1267,19 @@
         <w:tblLook w:firstColumn="1" w:firstRow="1" w:lastColumn="0" w:lastRow="0" w:noHBand="0" w:noVBand="1" w:val="04A0"/>
       </w:tblPr>
       <w:tblGrid>
-        <w:gridCol w:w="1337"/>
-        <w:gridCol w:w="1337"/>
-        <w:gridCol w:w="1337"/>
-        <w:gridCol w:w="1337"/>
-        <w:gridCol w:w="1337"/>
-        <w:gridCol w:w="1337"/>
-        <w:gridCol w:w="1337"/>
+        <w:gridCol w:w="1170"/>
+        <w:gridCol w:w="1170"/>
+        <w:gridCol w:w="1170"/>
+        <w:gridCol w:w="1170"/>
+        <w:gridCol w:w="1170"/>
+        <w:gridCol w:w="1170"/>
+        <w:gridCol w:w="1170"/>
+        <w:gridCol w:w="1170"/>
       </w:tblGrid>
       <w:tr>
         <w:tc>
           <w:tcPr>
-            <w:tcW w:type="dxa" w:w="1337"/>
+            <w:tcW w:type="dxa" w:w="1170"/>
             <w:shd w:val="clear" w:fill="1B4965"/>
           </w:tcPr>
           <w:p>
@@ -1380,7 +1291,7 @@
               <w:rPr>
                 <w:b/>
                 <w:color w:val="FFFFFF"/>
-                <w:sz w:val="21"/>
+                <w:sz w:val="18"/>
               </w:rPr>
               <w:t>Engine</w:t>
             </w:r>
@@ -1388,7 +1299,7 @@
         </w:tc>
         <w:tc>
           <w:tcPr>
-            <w:tcW w:type="dxa" w:w="1337"/>
+            <w:tcW w:type="dxa" w:w="1170"/>
             <w:shd w:val="clear" w:fill="1B4965"/>
           </w:tcPr>
           <w:p>
@@ -1400,7 +1311,7 @@
               <w:rPr>
                 <w:b/>
                 <w:color w:val="FFFFFF"/>
-                <w:sz w:val="21"/>
+                <w:sz w:val="18"/>
               </w:rPr>
               <w:t>Type</w:t>
             </w:r>
@@ -1408,7 +1319,7 @@
         </w:tc>
         <w:tc>
           <w:tcPr>
-            <w:tcW w:type="dxa" w:w="1337"/>
+            <w:tcW w:type="dxa" w:w="1170"/>
             <w:shd w:val="clear" w:fill="1B4965"/>
           </w:tcPr>
           <w:p>
@@ -1420,15 +1331,15 @@
               <w:rPr>
                 <w:b/>
                 <w:color w:val="FFFFFF"/>
-                <w:sz w:val="21"/>
+                <w:sz w:val="18"/>
               </w:rPr>
-              <w:t>WER ↓</w:t>
+              <w:t>WER% ↓</w:t>
             </w:r>
           </w:p>
         </w:tc>
         <w:tc>
           <w:tcPr>
-            <w:tcW w:type="dxa" w:w="1337"/>
+            <w:tcW w:type="dxa" w:w="1170"/>
             <w:shd w:val="clear" w:fill="1B4965"/>
           </w:tcPr>
           <w:p>
@@ -1440,15 +1351,15 @@
               <w:rPr>
                 <w:b/>
                 <w:color w:val="FFFFFF"/>
-                <w:sz w:val="21"/>
+                <w:sz w:val="18"/>
               </w:rPr>
-              <w:t>CER ↓</w:t>
+              <w:t>CER% ↓</w:t>
             </w:r>
           </w:p>
         </w:tc>
         <w:tc>
           <w:tcPr>
-            <w:tcW w:type="dxa" w:w="1337"/>
+            <w:tcW w:type="dxa" w:w="1170"/>
             <w:shd w:val="clear" w:fill="1B4965"/>
           </w:tcPr>
           <w:p>
@@ -1460,7 +1371,7 @@
               <w:rPr>
                 <w:b/>
                 <w:color w:val="FFFFFF"/>
-                <w:sz w:val="21"/>
+                <w:sz w:val="18"/>
               </w:rPr>
               <w:t>SECS ↑</w:t>
             </w:r>
@@ -1468,7 +1379,7 @@
         </w:tc>
         <w:tc>
           <w:tcPr>
-            <w:tcW w:type="dxa" w:w="1337"/>
+            <w:tcW w:type="dxa" w:w="1170"/>
             <w:shd w:val="clear" w:fill="1B4965"/>
           </w:tcPr>
           <w:p>
@@ -1480,7 +1391,7 @@
               <w:rPr>
                 <w:b/>
                 <w:color w:val="FFFFFF"/>
-                <w:sz w:val="21"/>
+                <w:sz w:val="18"/>
               </w:rPr>
               <w:t>Time (s)</w:t>
             </w:r>
@@ -1488,7 +1399,7 @@
         </w:tc>
         <w:tc>
           <w:tcPr>
-            <w:tcW w:type="dxa" w:w="1337"/>
+            <w:tcW w:type="dxa" w:w="1170"/>
             <w:shd w:val="clear" w:fill="1B4965"/>
           </w:tcPr>
           <w:p>
@@ -1500,9 +1411,29 @@
               <w:rPr>
                 <w:b/>
                 <w:color w:val="FFFFFF"/>
-                <w:sz w:val="21"/>
+                <w:sz w:val="18"/>
               </w:rPr>
               <w:t>RTF ↓</w:t>
+            </w:r>
+          </w:p>
+        </w:tc>
+        <w:tc>
+          <w:tcPr>
+            <w:tcW w:type="dxa" w:w="1170"/>
+            <w:shd w:val="clear" w:fill="1B4965"/>
+          </w:tcPr>
+          <w:p>
+            <w:pPr>
+              <w:jc w:val="center"/>
+            </w:pPr>
+            <w:r/>
+            <w:r>
+              <w:rPr>
+                <w:b/>
+                <w:color w:val="FFFFFF"/>
+                <w:sz w:val="18"/>
+              </w:rPr>
+              <w:t>N</w:t>
             </w:r>
           </w:p>
         </w:tc>
@@ -1510,7 +1441,7 @@
       <w:tr>
         <w:tc>
           <w:tcPr>
-            <w:tcW w:type="dxa" w:w="1337"/>
+            <w:tcW w:type="dxa" w:w="1170"/>
             <w:shd w:val="clear" w:fill="E7EEF2"/>
           </w:tcPr>
           <w:p>
@@ -1521,7 +1452,7 @@
             <w:r>
               <w:rPr>
                 <w:b/>
-                <w:sz w:val="21"/>
+                <w:sz w:val="18"/>
               </w:rPr>
               <w:t>F5-TTS</w:t>
             </w:r>
@@ -1529,7 +1460,7 @@
         </w:tc>
         <w:tc>
           <w:tcPr>
-            <w:tcW w:type="dxa" w:w="1337"/>
+            <w:tcW w:type="dxa" w:w="1170"/>
             <w:shd w:val="clear" w:fill="E7EEF2"/>
           </w:tcPr>
           <w:p>
@@ -1540,7 +1471,7 @@
             <w:r>
               <w:rPr>
                 <w:b w:val="0"/>
-                <w:sz w:val="21"/>
+                <w:sz w:val="17"/>
               </w:rPr>
               <w:t>voice cloning</w:t>
             </w:r>
@@ -1548,7 +1479,7 @@
         </w:tc>
         <w:tc>
           <w:tcPr>
-            <w:tcW w:type="dxa" w:w="1337"/>
+            <w:tcW w:type="dxa" w:w="1170"/>
             <w:shd w:val="clear" w:fill="E7EEF2"/>
           </w:tcPr>
           <w:p>
@@ -1560,15 +1491,188 @@
               <w:rPr>
                 <w:b/>
                 <w:color w:val="1B4965"/>
-                <w:sz w:val="21"/>
+                <w:sz w:val="18"/>
               </w:rPr>
-              <w:t>0.059</w:t>
+              <w:t>8.7 / 22.4</w:t>
             </w:r>
           </w:p>
         </w:tc>
         <w:tc>
           <w:tcPr>
-            <w:tcW w:type="dxa" w:w="1337"/>
+            <w:tcW w:type="dxa" w:w="1170"/>
+            <w:shd w:val="clear" w:fill="E7EEF2"/>
+          </w:tcPr>
+          <w:p>
+            <w:pPr>
+              <w:jc w:val="center"/>
+            </w:pPr>
+            <w:r/>
+            <w:r>
+              <w:rPr>
+                <w:b w:val="0"/>
+                <w:sz w:val="18"/>
+              </w:rPr>
+              <w:t>2.6 / 18.9</w:t>
+            </w:r>
+          </w:p>
+        </w:tc>
+        <w:tc>
+          <w:tcPr>
+            <w:tcW w:type="dxa" w:w="1170"/>
+            <w:shd w:val="clear" w:fill="E7EEF2"/>
+          </w:tcPr>
+          <w:p>
+            <w:pPr>
+              <w:jc w:val="center"/>
+            </w:pPr>
+            <w:r/>
+            <w:r>
+              <w:rPr>
+                <w:b w:val="0"/>
+                <w:sz w:val="18"/>
+              </w:rPr>
+              <w:t>0.862</w:t>
+            </w:r>
+          </w:p>
+        </w:tc>
+        <w:tc>
+          <w:tcPr>
+            <w:tcW w:type="dxa" w:w="1170"/>
+            <w:shd w:val="clear" w:fill="E7EEF2"/>
+          </w:tcPr>
+          <w:p>
+            <w:pPr>
+              <w:jc w:val="center"/>
+            </w:pPr>
+            <w:r/>
+            <w:r>
+              <w:rPr>
+                <w:b w:val="0"/>
+                <w:sz w:val="18"/>
+              </w:rPr>
+              <w:t>92.1</w:t>
+            </w:r>
+          </w:p>
+        </w:tc>
+        <w:tc>
+          <w:tcPr>
+            <w:tcW w:type="dxa" w:w="1170"/>
+            <w:shd w:val="clear" w:fill="E7EEF2"/>
+          </w:tcPr>
+          <w:p>
+            <w:pPr>
+              <w:jc w:val="center"/>
+            </w:pPr>
+            <w:r/>
+            <w:r>
+              <w:rPr>
+                <w:b w:val="0"/>
+                <w:sz w:val="18"/>
+              </w:rPr>
+              <w:t>22.75</w:t>
+            </w:r>
+          </w:p>
+        </w:tc>
+        <w:tc>
+          <w:tcPr>
+            <w:tcW w:type="dxa" w:w="1170"/>
+            <w:shd w:val="clear" w:fill="E7EEF2"/>
+          </w:tcPr>
+          <w:p>
+            <w:pPr>
+              <w:jc w:val="center"/>
+            </w:pPr>
+            <w:r/>
+            <w:r>
+              <w:rPr>
+                <w:b w:val="0"/>
+                <w:sz w:val="18"/>
+              </w:rPr>
+              <w:t>7</w:t>
+            </w:r>
+          </w:p>
+        </w:tc>
+      </w:tr>
+      <w:tr>
+        <w:tc>
+          <w:tcPr>
+            <w:tcW w:type="dxa" w:w="1170"/>
+            <w:shd w:val="clear" w:fill="E7EEF2"/>
+          </w:tcPr>
+          <w:p>
+            <w:pPr>
+              <w:jc w:val="left"/>
+            </w:pPr>
+            <w:r/>
+            <w:r>
+              <w:rPr>
+                <w:b/>
+                <w:sz w:val="18"/>
+              </w:rPr>
+              <w:t>XTTS-v2</w:t>
+            </w:r>
+          </w:p>
+        </w:tc>
+        <w:tc>
+          <w:tcPr>
+            <w:tcW w:type="dxa" w:w="1170"/>
+            <w:shd w:val="clear" w:fill="E7EEF2"/>
+          </w:tcPr>
+          <w:p>
+            <w:pPr>
+              <w:jc w:val="left"/>
+            </w:pPr>
+            <w:r/>
+            <w:r>
+              <w:rPr>
+                <w:b w:val="0"/>
+                <w:sz w:val="17"/>
+              </w:rPr>
+              <w:t>voice cloning</w:t>
+            </w:r>
+          </w:p>
+        </w:tc>
+        <w:tc>
+          <w:tcPr>
+            <w:tcW w:type="dxa" w:w="1170"/>
+            <w:shd w:val="clear" w:fill="E7EEF2"/>
+          </w:tcPr>
+          <w:p>
+            <w:pPr>
+              <w:jc w:val="center"/>
+            </w:pPr>
+            <w:r/>
+            <w:r>
+              <w:rPr>
+                <w:b w:val="0"/>
+                <w:sz w:val="18"/>
+              </w:rPr>
+              <w:t>11.1 / 21.8</w:t>
+            </w:r>
+          </w:p>
+        </w:tc>
+        <w:tc>
+          <w:tcPr>
+            <w:tcW w:type="dxa" w:w="1170"/>
+            <w:shd w:val="clear" w:fill="E7EEF2"/>
+          </w:tcPr>
+          <w:p>
+            <w:pPr>
+              <w:jc w:val="center"/>
+            </w:pPr>
+            <w:r/>
+            <w:r>
+              <w:rPr>
+                <w:b w:val="0"/>
+                <w:sz w:val="18"/>
+              </w:rPr>
+              <w:t>5.4 / 19.1</w:t>
+            </w:r>
+          </w:p>
+        </w:tc>
+        <w:tc>
+          <w:tcPr>
+            <w:tcW w:type="dxa" w:w="1170"/>
             <w:shd w:val="clear" w:fill="E7EEF2"/>
           </w:tcPr>
           <w:p>
@@ -1580,15 +1684,15 @@
               <w:rPr>
                 <w:b/>
                 <w:color w:val="1B4965"/>
-                <w:sz w:val="21"/>
+                <w:sz w:val="18"/>
               </w:rPr>
-              <w:t>0.026</w:t>
+              <w:t>0.877</w:t>
             </w:r>
           </w:p>
         </w:tc>
         <w:tc>
           <w:tcPr>
-            <w:tcW w:type="dxa" w:w="1337"/>
+            <w:tcW w:type="dxa" w:w="1170"/>
             <w:shd w:val="clear" w:fill="E7EEF2"/>
           </w:tcPr>
           <w:p>
@@ -1599,15 +1703,15 @@
             <w:r>
               <w:rPr>
                 <w:b w:val="0"/>
-                <w:sz w:val="21"/>
+                <w:sz w:val="18"/>
               </w:rPr>
-              <w:t>0.837</w:t>
+              <w:t>13.2</w:t>
             </w:r>
           </w:p>
         </w:tc>
         <w:tc>
           <w:tcPr>
-            <w:tcW w:type="dxa" w:w="1337"/>
+            <w:tcW w:type="dxa" w:w="1170"/>
             <w:shd w:val="clear" w:fill="E7EEF2"/>
           </w:tcPr>
           <w:p>
@@ -1618,15 +1722,15 @@
             <w:r>
               <w:rPr>
                 <w:b w:val="0"/>
-                <w:sz w:val="21"/>
+                <w:sz w:val="18"/>
               </w:rPr>
-              <w:t>193.0</w:t>
+              <w:t>2.92</w:t>
             </w:r>
           </w:p>
         </w:tc>
         <w:tc>
           <w:tcPr>
-            <w:tcW w:type="dxa" w:w="1337"/>
+            <w:tcW w:type="dxa" w:w="1170"/>
             <w:shd w:val="clear" w:fill="E7EEF2"/>
           </w:tcPr>
           <w:p>
@@ -1637,9 +1741,9 @@
             <w:r>
               <w:rPr>
                 <w:b w:val="0"/>
-                <w:sz w:val="21"/>
+                <w:sz w:val="18"/>
               </w:rPr>
-              <w:t>45.12</w:t>
+              <w:t>7</w:t>
             </w:r>
           </w:p>
         </w:tc>
@@ -1647,7 +1751,7 @@
       <w:tr>
         <w:tc>
           <w:tcPr>
-            <w:tcW w:type="dxa" w:w="1337"/>
+            <w:tcW w:type="dxa" w:w="1170"/>
           </w:tcPr>
           <w:p>
             <w:pPr>
@@ -1657,15 +1761,15 @@
             <w:r>
               <w:rPr>
                 <w:b/>
-                <w:sz w:val="21"/>
+                <w:sz w:val="18"/>
               </w:rPr>
-              <w:t>XTTS-v2</w:t>
+              <w:t>MMS-TTS</w:t>
             </w:r>
           </w:p>
         </w:tc>
         <w:tc>
           <w:tcPr>
-            <w:tcW w:type="dxa" w:w="1337"/>
+            <w:tcW w:type="dxa" w:w="1170"/>
           </w:tcPr>
           <w:p>
             <w:pPr>
@@ -1675,15 +1779,15 @@
             <w:r>
               <w:rPr>
                 <w:b w:val="0"/>
-                <w:sz w:val="21"/>
+                <w:sz w:val="17"/>
               </w:rPr>
-              <w:t>voice cloning</w:t>
+              <w:t>fixed voice</w:t>
             </w:r>
           </w:p>
         </w:tc>
         <w:tc>
           <w:tcPr>
-            <w:tcW w:type="dxa" w:w="1337"/>
+            <w:tcW w:type="dxa" w:w="1170"/>
           </w:tcPr>
           <w:p>
             <w:pPr>
@@ -1693,15 +1797,15 @@
             <w:r>
               <w:rPr>
                 <w:b w:val="0"/>
-                <w:sz w:val="21"/>
+                <w:sz w:val="18"/>
               </w:rPr>
-              <w:t>0.118</w:t>
+              <w:t>36.4 / 43.2</w:t>
             </w:r>
           </w:p>
         </w:tc>
         <w:tc>
           <w:tcPr>
-            <w:tcW w:type="dxa" w:w="1337"/>
+            <w:tcW w:type="dxa" w:w="1170"/>
           </w:tcPr>
           <w:p>
             <w:pPr>
@@ -1711,34 +1815,15 @@
             <w:r>
               <w:rPr>
                 <w:b w:val="0"/>
-                <w:sz w:val="21"/>
+                <w:sz w:val="18"/>
               </w:rPr>
-              <w:t>0.065</w:t>
+              <w:t>15.5 / 26.6</w:t>
             </w:r>
           </w:p>
         </w:tc>
         <w:tc>
           <w:tcPr>
-            <w:tcW w:type="dxa" w:w="1337"/>
-          </w:tcPr>
-          <w:p>
-            <w:pPr>
-              <w:jc w:val="center"/>
-            </w:pPr>
-            <w:r/>
-            <w:r>
-              <w:rPr>
-                <w:b/>
-                <w:color w:val="1B4965"/>
-                <w:sz w:val="21"/>
-              </w:rPr>
-              <w:t>0.888</w:t>
-            </w:r>
-          </w:p>
-        </w:tc>
-        <w:tc>
-          <w:tcPr>
-            <w:tcW w:type="dxa" w:w="1337"/>
+            <w:tcW w:type="dxa" w:w="1170"/>
           </w:tcPr>
           <w:p>
             <w:pPr>
@@ -1748,15 +1833,15 @@
             <w:r>
               <w:rPr>
                 <w:b w:val="0"/>
-                <w:sz w:val="21"/>
+                <w:sz w:val="18"/>
               </w:rPr>
-              <w:t>36.2</w:t>
+              <w:t>0.618</w:t>
             </w:r>
           </w:p>
         </w:tc>
         <w:tc>
           <w:tcPr>
-            <w:tcW w:type="dxa" w:w="1337"/>
+            <w:tcW w:type="dxa" w:w="1170"/>
           </w:tcPr>
           <w:p>
             <w:pPr>
@@ -1766,9 +1851,45 @@
             <w:r>
               <w:rPr>
                 <w:b w:val="0"/>
-                <w:sz w:val="21"/>
+                <w:sz w:val="18"/>
               </w:rPr>
-              <w:t>8.48</w:t>
+              <w:t>2.2</w:t>
+            </w:r>
+          </w:p>
+        </w:tc>
+        <w:tc>
+          <w:tcPr>
+            <w:tcW w:type="dxa" w:w="1170"/>
+          </w:tcPr>
+          <w:p>
+            <w:pPr>
+              <w:jc w:val="center"/>
+            </w:pPr>
+            <w:r/>
+            <w:r>
+              <w:rPr>
+                <w:b w:val="0"/>
+                <w:sz w:val="18"/>
+              </w:rPr>
+              <w:t>0.39</w:t>
+            </w:r>
+          </w:p>
+        </w:tc>
+        <w:tc>
+          <w:tcPr>
+            <w:tcW w:type="dxa" w:w="1170"/>
+          </w:tcPr>
+          <w:p>
+            <w:pPr>
+              <w:jc w:val="center"/>
+            </w:pPr>
+            <w:r/>
+            <w:r>
+              <w:rPr>
+                <w:b w:val="0"/>
+                <w:sz w:val="18"/>
+              </w:rPr>
+              <w:t>7</w:t>
             </w:r>
           </w:p>
         </w:tc>
@@ -1776,7 +1897,7 @@
       <w:tr>
         <w:tc>
           <w:tcPr>
-            <w:tcW w:type="dxa" w:w="1337"/>
+            <w:tcW w:type="dxa" w:w="1170"/>
           </w:tcPr>
           <w:p>
             <w:pPr>
@@ -1786,15 +1907,15 @@
             <w:r>
               <w:rPr>
                 <w:b/>
-                <w:sz w:val="21"/>
+                <w:sz w:val="18"/>
               </w:rPr>
-              <w:t>MMS-TTS</w:t>
+              <w:t>Piper</w:t>
             </w:r>
           </w:p>
         </w:tc>
         <w:tc>
           <w:tcPr>
-            <w:tcW w:type="dxa" w:w="1337"/>
+            <w:tcW w:type="dxa" w:w="1170"/>
           </w:tcPr>
           <w:p>
             <w:pPr>
@@ -1804,7 +1925,7 @@
             <w:r>
               <w:rPr>
                 <w:b w:val="0"/>
-                <w:sz w:val="21"/>
+                <w:sz w:val="17"/>
               </w:rPr>
               <w:t>fixed voice</w:t>
             </w:r>
@@ -1812,7 +1933,7 @@
         </w:tc>
         <w:tc>
           <w:tcPr>
-            <w:tcW w:type="dxa" w:w="1337"/>
+            <w:tcW w:type="dxa" w:w="1170"/>
           </w:tcPr>
           <w:p>
             <w:pPr>
@@ -1822,15 +1943,15 @@
             <w:r>
               <w:rPr>
                 <w:b w:val="0"/>
-                <w:sz w:val="21"/>
+                <w:sz w:val="18"/>
               </w:rPr>
-              <w:t>0.118</w:t>
+              <w:t>9.1 / 27.1</w:t>
             </w:r>
           </w:p>
         </w:tc>
         <w:tc>
           <w:tcPr>
-            <w:tcW w:type="dxa" w:w="1337"/>
+            <w:tcW w:type="dxa" w:w="1170"/>
           </w:tcPr>
           <w:p>
             <w:pPr>
@@ -1840,15 +1961,15 @@
             <w:r>
               <w:rPr>
                 <w:b w:val="0"/>
-                <w:sz w:val="21"/>
+                <w:sz w:val="18"/>
               </w:rPr>
-              <w:t>0.039</w:t>
+              <w:t>6.8 / 21.8</w:t>
             </w:r>
           </w:p>
         </w:tc>
         <w:tc>
           <w:tcPr>
-            <w:tcW w:type="dxa" w:w="1337"/>
+            <w:tcW w:type="dxa" w:w="1170"/>
           </w:tcPr>
           <w:p>
             <w:pPr>
@@ -1858,15 +1979,15 @@
             <w:r>
               <w:rPr>
                 <w:b w:val="0"/>
-                <w:sz w:val="21"/>
+                <w:sz w:val="18"/>
               </w:rPr>
-              <w:t>0.601</w:t>
+              <w:t>0.637</w:t>
             </w:r>
           </w:p>
         </w:tc>
         <w:tc>
           <w:tcPr>
-            <w:tcW w:type="dxa" w:w="1337"/>
+            <w:tcW w:type="dxa" w:w="1170"/>
           </w:tcPr>
           <w:p>
             <w:pPr>
@@ -1876,15 +1997,15 @@
             <w:r>
               <w:rPr>
                 <w:b w:val="0"/>
-                <w:sz w:val="21"/>
+                <w:sz w:val="18"/>
               </w:rPr>
-              <w:t>3.9</w:t>
+              <w:t>0.5</w:t>
             </w:r>
           </w:p>
         </w:tc>
         <w:tc>
           <w:tcPr>
-            <w:tcW w:type="dxa" w:w="1337"/>
+            <w:tcW w:type="dxa" w:w="1170"/>
           </w:tcPr>
           <w:p>
             <w:pPr>
@@ -1894,9 +2015,27 @@
             <w:r>
               <w:rPr>
                 <w:b w:val="0"/>
-                <w:sz w:val="21"/>
+                <w:sz w:val="18"/>
               </w:rPr>
-              <w:t>0.61</w:t>
+              <w:t>0.15</w:t>
+            </w:r>
+          </w:p>
+        </w:tc>
+        <w:tc>
+          <w:tcPr>
+            <w:tcW w:type="dxa" w:w="1170"/>
+          </w:tcPr>
+          <w:p>
+            <w:pPr>
+              <w:jc w:val="center"/>
+            </w:pPr>
+            <w:r/>
+            <w:r>
+              <w:rPr>
+                <w:b w:val="0"/>
+                <w:sz w:val="18"/>
+              </w:rPr>
+              <w:t>7</w:t>
             </w:r>
           </w:p>
         </w:tc>
@@ -1904,7 +2043,7 @@
       <w:tr>
         <w:tc>
           <w:tcPr>
-            <w:tcW w:type="dxa" w:w="1337"/>
+            <w:tcW w:type="dxa" w:w="1170"/>
           </w:tcPr>
           <w:p>
             <w:pPr>
@@ -1914,15 +2053,15 @@
             <w:r>
               <w:rPr>
                 <w:b/>
-                <w:sz w:val="21"/>
+                <w:sz w:val="18"/>
               </w:rPr>
-              <w:t>Piper</w:t>
+              <w:t>Edge-TTS</w:t>
             </w:r>
           </w:p>
         </w:tc>
         <w:tc>
           <w:tcPr>
-            <w:tcW w:type="dxa" w:w="1337"/>
+            <w:tcW w:type="dxa" w:w="1170"/>
           </w:tcPr>
           <w:p>
             <w:pPr>
@@ -1932,15 +2071,15 @@
             <w:r>
               <w:rPr>
                 <w:b w:val="0"/>
-                <w:sz w:val="21"/>
+                <w:sz w:val="17"/>
               </w:rPr>
-              <w:t>fixed voice</w:t>
+              <w:t>cloud, fixed</w:t>
             </w:r>
           </w:p>
         </w:tc>
         <w:tc>
           <w:tcPr>
-            <w:tcW w:type="dxa" w:w="1337"/>
+            <w:tcW w:type="dxa" w:w="1170"/>
           </w:tcPr>
           <w:p>
             <w:pPr>
@@ -1950,15 +2089,15 @@
             <w:r>
               <w:rPr>
                 <w:b w:val="0"/>
-                <w:sz w:val="21"/>
+                <w:sz w:val="18"/>
               </w:rPr>
-              <w:t>0.118</w:t>
+              <w:t>9.1 / 23.9</w:t>
             </w:r>
           </w:p>
         </w:tc>
         <w:tc>
           <w:tcPr>
-            <w:tcW w:type="dxa" w:w="1337"/>
+            <w:tcW w:type="dxa" w:w="1170"/>
           </w:tcPr>
           <w:p>
             <w:pPr>
@@ -1968,15 +2107,15 @@
             <w:r>
               <w:rPr>
                 <w:b w:val="0"/>
-                <w:sz w:val="21"/>
+                <w:sz w:val="18"/>
               </w:rPr>
-              <w:t>0.052</w:t>
+              <w:t>3.9 / 20.5</w:t>
             </w:r>
           </w:p>
         </w:tc>
         <w:tc>
           <w:tcPr>
-            <w:tcW w:type="dxa" w:w="1337"/>
+            <w:tcW w:type="dxa" w:w="1170"/>
           </w:tcPr>
           <w:p>
             <w:pPr>
@@ -1986,15 +2125,15 @@
             <w:r>
               <w:rPr>
                 <w:b w:val="0"/>
-                <w:sz w:val="21"/>
+                <w:sz w:val="18"/>
               </w:rPr>
-              <w:t>0.615</w:t>
+              <w:t>0.565</w:t>
             </w:r>
           </w:p>
         </w:tc>
         <w:tc>
           <w:tcPr>
-            <w:tcW w:type="dxa" w:w="1337"/>
+            <w:tcW w:type="dxa" w:w="1170"/>
           </w:tcPr>
           <w:p>
             <w:pPr>
@@ -2004,15 +2143,15 @@
             <w:r>
               <w:rPr>
                 <w:b w:val="0"/>
-                <w:sz w:val="21"/>
+                <w:sz w:val="18"/>
               </w:rPr>
-              <w:t>2.1</w:t>
+              <w:t>2.9</w:t>
             </w:r>
           </w:p>
         </w:tc>
         <w:tc>
           <w:tcPr>
-            <w:tcW w:type="dxa" w:w="1337"/>
+            <w:tcW w:type="dxa" w:w="1170"/>
           </w:tcPr>
           <w:p>
             <w:pPr>
@@ -2022,9 +2161,27 @@
             <w:r>
               <w:rPr>
                 <w:b w:val="0"/>
-                <w:sz w:val="21"/>
+                <w:sz w:val="18"/>
               </w:rPr>
-              <w:t>0.59</w:t>
+              <w:t>0.55</w:t>
+            </w:r>
+          </w:p>
+        </w:tc>
+        <w:tc>
+          <w:tcPr>
+            <w:tcW w:type="dxa" w:w="1170"/>
+          </w:tcPr>
+          <w:p>
+            <w:pPr>
+              <w:jc w:val="center"/>
+            </w:pPr>
+            <w:r/>
+            <w:r>
+              <w:rPr>
+                <w:b w:val="0"/>
+                <w:sz w:val="18"/>
+              </w:rPr>
+              <w:t>7</w:t>
             </w:r>
           </w:p>
         </w:tc>
@@ -2032,7 +2189,7 @@
       <w:tr>
         <w:tc>
           <w:tcPr>
-            <w:tcW w:type="dxa" w:w="1337"/>
+            <w:tcW w:type="dxa" w:w="1170"/>
           </w:tcPr>
           <w:p>
             <w:pPr>
@@ -2042,15 +2199,15 @@
             <w:r>
               <w:rPr>
                 <w:b/>
-                <w:sz w:val="21"/>
+                <w:sz w:val="18"/>
               </w:rPr>
-              <w:t>Edge-TTS</w:t>
+              <w:t>Bark</w:t>
             </w:r>
           </w:p>
         </w:tc>
         <w:tc>
           <w:tcPr>
-            <w:tcW w:type="dxa" w:w="1337"/>
+            <w:tcW w:type="dxa" w:w="1170"/>
           </w:tcPr>
           <w:p>
             <w:pPr>
@@ -2060,15 +2217,15 @@
             <w:r>
               <w:rPr>
                 <w:b w:val="0"/>
-                <w:sz w:val="21"/>
+                <w:sz w:val="17"/>
               </w:rPr>
-              <w:t>cloud, fixed</w:t>
+              <w:t>fixed (no VI)</w:t>
             </w:r>
           </w:p>
         </w:tc>
         <w:tc>
           <w:tcPr>
-            <w:tcW w:type="dxa" w:w="1337"/>
+            <w:tcW w:type="dxa" w:w="1170"/>
           </w:tcPr>
           <w:p>
             <w:pPr>
@@ -2078,15 +2235,15 @@
             <w:r>
               <w:rPr>
                 <w:b w:val="0"/>
-                <w:sz w:val="21"/>
+                <w:sz w:val="18"/>
               </w:rPr>
-              <w:t>0.118</w:t>
+              <w:t>125.0 / 145.3</w:t>
             </w:r>
           </w:p>
         </w:tc>
         <w:tc>
           <w:tcPr>
-            <w:tcW w:type="dxa" w:w="1337"/>
+            <w:tcW w:type="dxa" w:w="1170"/>
           </w:tcPr>
           <w:p>
             <w:pPr>
@@ -2096,15 +2253,15 @@
             <w:r>
               <w:rPr>
                 <w:b w:val="0"/>
-                <w:sz w:val="21"/>
+                <w:sz w:val="18"/>
               </w:rPr>
-              <w:t>0.065</w:t>
+              <w:t>96.4 / 122.4</w:t>
             </w:r>
           </w:p>
         </w:tc>
         <w:tc>
           <w:tcPr>
-            <w:tcW w:type="dxa" w:w="1337"/>
+            <w:tcW w:type="dxa" w:w="1170"/>
           </w:tcPr>
           <w:p>
             <w:pPr>
@@ -2114,15 +2271,15 @@
             <w:r>
               <w:rPr>
                 <w:b w:val="0"/>
-                <w:sz w:val="21"/>
+                <w:sz w:val="18"/>
               </w:rPr>
-              <w:t>0.561</w:t>
+              <w:t>0.469</w:t>
             </w:r>
           </w:p>
         </w:tc>
         <w:tc>
           <w:tcPr>
-            <w:tcW w:type="dxa" w:w="1337"/>
+            <w:tcW w:type="dxa" w:w="1170"/>
           </w:tcPr>
           <w:p>
             <w:pPr>
@@ -2132,15 +2289,15 @@
             <w:r>
               <w:rPr>
                 <w:b w:val="0"/>
-                <w:sz w:val="21"/>
+                <w:sz w:val="18"/>
               </w:rPr>
-              <w:t>3.0</w:t>
+              <w:t>105.8</w:t>
             </w:r>
           </w:p>
         </w:tc>
         <w:tc>
           <w:tcPr>
-            <w:tcW w:type="dxa" w:w="1337"/>
+            <w:tcW w:type="dxa" w:w="1170"/>
           </w:tcPr>
           <w:p>
             <w:pPr>
@@ -2150,53 +2307,15 @@
             <w:r>
               <w:rPr>
                 <w:b w:val="0"/>
-                <w:sz w:val="21"/>
+                <w:sz w:val="18"/>
               </w:rPr>
-              <w:t>0.65</w:t>
-            </w:r>
-          </w:p>
-        </w:tc>
-      </w:tr>
-      <w:tr>
-        <w:tc>
-          <w:tcPr>
-            <w:tcW w:type="dxa" w:w="1337"/>
-          </w:tcPr>
-          <w:p>
-            <w:pPr>
-              <w:jc w:val="left"/>
-            </w:pPr>
-            <w:r/>
-            <w:r>
-              <w:rPr>
-                <w:b/>
-                <w:sz w:val="21"/>
-              </w:rPr>
-              <w:t>Bark</w:t>
+              <w:t>7.48</w:t>
             </w:r>
           </w:p>
         </w:tc>
         <w:tc>
           <w:tcPr>
-            <w:tcW w:type="dxa" w:w="1337"/>
-          </w:tcPr>
-          <w:p>
-            <w:pPr>
-              <w:jc w:val="left"/>
-            </w:pPr>
-            <w:r/>
-            <w:r>
-              <w:rPr>
-                <w:b w:val="0"/>
-                <w:sz w:val="21"/>
-              </w:rPr>
-              <w:t>fixed (no VI)</w:t>
-            </w:r>
-          </w:p>
-        </w:tc>
-        <w:tc>
-          <w:tcPr>
-            <w:tcW w:type="dxa" w:w="1337"/>
+            <w:tcW w:type="dxa" w:w="1170"/>
           </w:tcPr>
           <w:p>
             <w:pPr>
@@ -2206,81 +2325,9 @@
             <w:r>
               <w:rPr>
                 <w:b w:val="0"/>
-                <w:sz w:val="21"/>
+                <w:sz w:val="18"/>
               </w:rPr>
-              <w:t>1.176</w:t>
-            </w:r>
-          </w:p>
-        </w:tc>
-        <w:tc>
-          <w:tcPr>
-            <w:tcW w:type="dxa" w:w="1337"/>
-          </w:tcPr>
-          <w:p>
-            <w:pPr>
-              <w:jc w:val="center"/>
-            </w:pPr>
-            <w:r/>
-            <w:r>
-              <w:rPr>
-                <w:b w:val="0"/>
-                <w:sz w:val="21"/>
-              </w:rPr>
-              <w:t>0.844</w:t>
-            </w:r>
-          </w:p>
-        </w:tc>
-        <w:tc>
-          <w:tcPr>
-            <w:tcW w:type="dxa" w:w="1337"/>
-          </w:tcPr>
-          <w:p>
-            <w:pPr>
-              <w:jc w:val="center"/>
-            </w:pPr>
-            <w:r/>
-            <w:r>
-              <w:rPr>
-                <w:b w:val="0"/>
-                <w:sz w:val="21"/>
-              </w:rPr>
-              <w:t>0.480</w:t>
-            </w:r>
-          </w:p>
-        </w:tc>
-        <w:tc>
-          <w:tcPr>
-            <w:tcW w:type="dxa" w:w="1337"/>
-          </w:tcPr>
-          <w:p>
-            <w:pPr>
-              <w:jc w:val="center"/>
-            </w:pPr>
-            <w:r/>
-            <w:r>
-              <w:rPr>
-                <w:b w:val="0"/>
-                <w:sz w:val="21"/>
-              </w:rPr>
-              <w:t>167.2</w:t>
-            </w:r>
-          </w:p>
-        </w:tc>
-        <w:tc>
-          <w:tcPr>
-            <w:tcW w:type="dxa" w:w="1337"/>
-          </w:tcPr>
-          <w:p>
-            <w:pPr>
-              <w:jc w:val="center"/>
-            </w:pPr>
-            <w:r/>
-            <w:r>
-              <w:rPr>
-                <w:b w:val="0"/>
-                <w:sz w:val="21"/>
-              </w:rPr>
-              <w:t>11.59</w:t>
+              <w:t>7</w:t>
             </w:r>
           </w:p>
         </w:tc>
@@ -2297,7 +2344,7 @@
           <w:color w:val="5B6778"/>
           <w:sz w:val="19"/>
         </w:rPr>
-        <w:t>Table 2. Objective results: six engines, identical sentence / seed / reference. Blue marks the best value per column.</w:t>
+        <w:t>Table 2. Objective results over N=7 sentences (identical text / seed / reference). WER% and CER% shown as median / mean. Voice-cloning engines are shaded; blue marks the best median WER and the best SECS.</w:t>
       </w:r>
     </w:p>
     <w:p>
@@ -2307,7 +2354,7 @@
       <w:r>
         <w:drawing>
           <wp:inline xmlns:a="http://schemas.openxmlformats.org/drawingml/2006/main" xmlns:pic="http://schemas.openxmlformats.org/drawingml/2006/picture">
-            <wp:extent cx="5577840" cy="2231136"/>
+            <wp:extent cx="5577840" cy="2279044"/>
             <wp:docPr id="1" name="Picture 1"/>
             <wp:cNvGraphicFramePr>
               <a:graphicFrameLocks noChangeAspect="1"/>
@@ -2328,7 +2375,7 @@
                   <pic:spPr>
                     <a:xfrm>
                       <a:off x="0" y="0"/>
-                      <a:ext cx="5577840" cy="2231136"/>
+                      <a:ext cx="5577840" cy="2279044"/>
                     </a:xfrm>
                     <a:prstGeom prst="rect"/>
                   </pic:spPr>
@@ -2350,7 +2397,7 @@
           <w:color w:val="5B6778"/>
           <w:sz w:val="19"/>
         </w:rPr>
-        <w:t>Figure 1. Intelligibility via ASR round-trip. F5-TTS attains the lowest WER (5.9%); the XTTS/MMS/Piper/Edge cluster sits near 11.8%; Bark exceeds 100% (cannot read Vietnamese).</w:t>
+        <w:t>Figure 1. Intelligibility via ASR round-trip (bars = mean, whiskers = std over 7 sentences). The strong engines cluster closely; Bark (no Vietnamese) is the clear lower bound.</w:t>
       </w:r>
     </w:p>
     <w:p>
@@ -2360,7 +2407,7 @@
       <w:r>
         <w:drawing>
           <wp:inline xmlns:a="http://schemas.openxmlformats.org/drawingml/2006/main" xmlns:pic="http://schemas.openxmlformats.org/drawingml/2006/picture">
-            <wp:extent cx="5577840" cy="2950262"/>
+            <wp:extent cx="5577840" cy="3019408"/>
             <wp:docPr id="2" name="Picture 2"/>
             <wp:cNvGraphicFramePr>
               <a:graphicFrameLocks noChangeAspect="1"/>
@@ -2381,7 +2428,7 @@
                   <pic:spPr>
                     <a:xfrm>
                       <a:off x="0" y="0"/>
-                      <a:ext cx="5577840" cy="2950262"/>
+                      <a:ext cx="5577840" cy="3019408"/>
                     </a:xfrm>
                     <a:prstGeom prst="rect"/>
                   </pic:spPr>
@@ -2403,7 +2450,7 @@
           <w:color w:val="5B6778"/>
           <w:sz w:val="19"/>
         </w:rPr>
-        <w:t>Figure 2. Speaker similarity (SECS). Only F5-TTS (0.837) and XTTS-v2 (0.888) enter the voice-cloning region (&gt;0.75); fixed-voice engines score ≈0.56–0.62.</w:t>
+        <w:t>Figure 2. Speaker similarity (SECS). Only the two cloning engines, F5-TTS (0.862) and XTTS-v2 (0.877), enter the voice-cloning region (&gt;0.75); fixed-voice engines fall well below it.</w:t>
       </w:r>
     </w:p>
     <w:p>
@@ -2413,7 +2460,7 @@
       <w:r>
         <w:drawing>
           <wp:inline xmlns:a="http://schemas.openxmlformats.org/drawingml/2006/main" xmlns:pic="http://schemas.openxmlformats.org/drawingml/2006/picture">
-            <wp:extent cx="5577840" cy="2950262"/>
+            <wp:extent cx="5577840" cy="3019408"/>
             <wp:docPr id="3" name="Picture 3"/>
             <wp:cNvGraphicFramePr>
               <a:graphicFrameLocks noChangeAspect="1"/>
@@ -2434,7 +2481,7 @@
                   <pic:spPr>
                     <a:xfrm>
                       <a:off x="0" y="0"/>
-                      <a:ext cx="5577840" cy="2950262"/>
+                      <a:ext cx="5577840" cy="3019408"/>
                     </a:xfrm>
                     <a:prstGeom prst="rect"/>
                   </pic:spPr>
@@ -2456,7 +2503,7 @@
           <w:color w:val="5B6778"/>
           <w:sz w:val="19"/>
         </w:rPr>
-        <w:t>Figure 3. Generation speed (RTF, log scale). Piper/MMS/Edge run faster than real time on CPU; F5-TTS is slowest (quality and multi-step flow matching), expected to drop on GPU.</w:t>
+        <w:t>Figure 3. Generation speed (RTF, log scale; lower is faster). Fixed-voice engines run at or faster than real time on CPU; the flow-matching cloning models are slower on CPU and are expected to speed up substantially on GPU.</w:t>
       </w:r>
     </w:p>
     <w:p>
@@ -2509,7 +2556,60 @@
           <w:color w:val="5B6778"/>
           <w:sz w:val="19"/>
         </w:rPr>
-        <w:t>Figure 4. The central trade-off — intelligibility (1−WER) vs. speaker identity; bubble size ∝ speed. Only F5-TTS and XTTS-v2 reach the top-right; Bark falls to the bottom.</w:t>
+        <w:t>Figure 4. The central trade-off — intelligibility (1−mean WER) vs. speaker identity; bubble size ∝ speed. Speaker similarity, not intelligibility, is what separates cloning from fixed-voice engines.</w:t>
+      </w:r>
+    </w:p>
+    <w:p>
+      <w:pPr>
+        <w:jc w:val="center"/>
+      </w:pPr>
+      <w:r>
+        <w:drawing>
+          <wp:inline xmlns:a="http://schemas.openxmlformats.org/drawingml/2006/main" xmlns:pic="http://schemas.openxmlformats.org/drawingml/2006/picture">
+            <wp:extent cx="5577840" cy="2809889"/>
+            <wp:docPr id="5" name="Picture 5"/>
+            <wp:cNvGraphicFramePr>
+              <a:graphicFrameLocks noChangeAspect="1"/>
+            </wp:cNvGraphicFramePr>
+            <a:graphic>
+              <a:graphicData uri="http://schemas.openxmlformats.org/drawingml/2006/picture">
+                <pic:pic>
+                  <pic:nvPicPr>
+                    <pic:cNvPr id="0" name="wer_distribution.png"/>
+                    <pic:cNvPicPr/>
+                  </pic:nvPicPr>
+                  <pic:blipFill>
+                    <a:blip r:embed="rId13"/>
+                    <a:stretch>
+                      <a:fillRect/>
+                    </a:stretch>
+                  </pic:blipFill>
+                  <pic:spPr>
+                    <a:xfrm>
+                      <a:off x="0" y="0"/>
+                      <a:ext cx="5577840" cy="2809889"/>
+                    </a:xfrm>
+                    <a:prstGeom prst="rect"/>
+                  </pic:spPr>
+                </pic:pic>
+              </a:graphicData>
+            </a:graphic>
+          </wp:inline>
+        </w:drawing>
+      </w:r>
+    </w:p>
+    <w:p>
+      <w:pPr>
+        <w:spacing w:after="200"/>
+        <w:jc w:val="center"/>
+      </w:pPr>
+      <w:r>
+        <w:rPr>
+          <w:i/>
+          <w:color w:val="5B6778"/>
+          <w:sz w:val="19"/>
+        </w:rPr>
+        <w:t>Figure 5. Per-sentence WER across the 7 sentences (each dot is one sentence; the bar is the mean). It visualizes uncertainty: most sentences score low, while a few hard ones (numbers/dates) pull the mean up — which is why the median is the more robust summary.</w:t>
       </w:r>
     </w:p>
     <w:p>
@@ -2526,7 +2626,7 @@
         <w:jc w:val="both"/>
       </w:pPr>
       <w:r>
-        <w:t>F5-TTS wins on balance — the only engine simultaneously the most intelligible (WER 5.9%) and near the top on identity (SECS 0.837), exactly the joint objective of voice cloning.</w:t>
+        <w:t>Speaker identity is the decisive axis — only the two voice-cloning engines exceed the 0.75 cloning threshold (F5-TTS 0.862, XTTS-v2 0.877), whereas the fixed-voice engines score ≈0.56–0.64 — they render a default voice, not the reference speaker. This is the core voice-cloning result.</w:t>
       </w:r>
     </w:p>
     <w:p>
@@ -2535,7 +2635,7 @@
         <w:jc w:val="both"/>
       </w:pPr>
       <w:r>
-        <w:t>XTTS-v2 is a strong, faster alternative — highest SECS (0.888) and ~5× faster than F5-TTS on CPU, but double the WER; the right pick when identity and speed outweigh accuracy.</w:t>
+        <w:t>Intelligibility is broadly comparable among the strong engines — median WER for F5-TTS (8.7%) and XTTS-v2 (11.1%) is close to the best fixed-voice engines, and on 7 sentences these gaps are within noise. F5-TTS has the lowest median WER; XTTS-v2 the lowest mean — effectively a tie.</w:t>
       </w:r>
     </w:p>
     <w:p>
@@ -2544,7 +2644,7 @@
         <w:jc w:val="both"/>
       </w:pPr>
       <w:r>
-        <w:t>Fixed-voice TTS is not cloning — MMS/Piper/Edge are intelligible and very fast (RTF &lt; 1) yet score SECS ≈ 0.6, confirming they do not reproduce the reference speaker.</w:t>
+        <w:t>Median vs. mean matters — means are inflated by a few hard sentences (numbers and dates) where the spoken form and Whisper's transcription legitimately differ (Figure 5); the median is the more robust central tendency here.</w:t>
       </w:r>
     </w:p>
     <w:p>
@@ -2553,7 +2653,7 @@
         <w:jc w:val="both"/>
       </w:pPr>
       <w:r>
-        <w:t>CER stays below WER for every good engine — F5-TTS errs chiefly on the first word (“Trí”→“Chí”, a regional tr/ch merge), a pronunciation artifact, not an intelligibility failure.</w:t>
+        <w:t>Cost of quality — the cloning engines are slower on CPU (F5-TTS RTF 22.7, XTTS-v2 2.9) than the fixed-voice engines (RTF &lt; 1); XTTS-v2 is the faster of the two on CPU.</w:t>
       </w:r>
     </w:p>
     <w:p>
@@ -2562,7 +2662,68 @@
         <w:jc w:val="both"/>
       </w:pPr>
       <w:r>
-        <w:t>The metrics catch real failure — Bark is automatically flagged (WER &gt; 100%, lowest SECS), showing the harness genuinely separates broken from working systems.</w:t>
+        <w:t>The harness catches real failure — the deliberately weak baseline (Bark, no Vietnamese support) is separated automatically by very high WER and the lowest SECS, evidence that the metrics measure something real rather than rewarding every engine equally.</w:t>
+      </w:r>
+    </w:p>
+    <w:p>
+      <w:pPr>
+        <w:pStyle w:val="Heading2"/>
+      </w:pPr>
+      <w:r>
+        <w:t>9.2  Limitations and Uncertainty</w:t>
+      </w:r>
+    </w:p>
+    <w:p>
+      <w:pPr>
+        <w:pStyle w:val="ListBullet"/>
+        <w:jc w:val="both"/>
+      </w:pPr>
+      <w:r>
+        <w:t>Test-set scale — results cover 7 sentences per engine; error bars (Figure 1) and the distribution (Figure 5) quantify spread, but a larger, category-balanced set would tighten the estimates and enable significance testing.</w:t>
+      </w:r>
+    </w:p>
+    <w:p>
+      <w:pPr>
+        <w:pStyle w:val="ListBullet"/>
+        <w:jc w:val="both"/>
+      </w:pPr>
+      <w:r>
+        <w:t>ASR is imperfect — Whisper itself mis-transcribes, especially tones, so WER/CER are upper bounds on the true error and are most meaningful when compared across engines.</w:t>
+      </w:r>
+    </w:p>
+    <w:p>
+      <w:pPr>
+        <w:pStyle w:val="ListBullet"/>
+        <w:jc w:val="both"/>
+      </w:pPr>
+      <w:r>
+        <w:t>SECS is relative — it is a similarity score between embeddings, not biometric proof, and it does not replace subjective human listening (a MOS study remains future work).</w:t>
+      </w:r>
+    </w:p>
+    <w:p>
+      <w:pPr>
+        <w:pStyle w:val="ListBullet"/>
+        <w:jc w:val="both"/>
+      </w:pPr>
+      <w:r>
+        <w:t>Speed is CPU-measured — inference time and RTF are CPU figures (and the first call per engine includes model-load overhead); absolute latency will differ on GPU.</w:t>
+      </w:r>
+    </w:p>
+    <w:p>
+      <w:pPr>
+        <w:pStyle w:val="ListBullet"/>
+        <w:jc w:val="both"/>
+      </w:pPr>
+      <w:r>
+        <w:t>Base model only — these numbers characterize the zero-shot base model; the fine-tuning pipeline is established and verified at the code-path level but not yet run end-to-end on real speaker data with a GPU, so no fine-tuning improvement is claimed.</w:t>
+      </w:r>
+    </w:p>
+    <w:p>
+      <w:pPr>
+        <w:pStyle w:val="Heading1"/>
+      </w:pPr>
+      <w:r>
+        <w:t>10.  Conclusion and Recommendations (Provisional)</w:t>
       </w:r>
     </w:p>
     <w:p>
@@ -2574,15 +2735,7 @@
           <w:i/>
           <w:color w:val="5B6778"/>
         </w:rPr>
-        <w:t>Uncertainty: this is a pilot-scale audit (one sentence per engine), so confidence intervals are not yet available; Whisper itself errs (WER/CER are upper bounds); SECS is relative; and speed is measured on CPU including first-load overhead. A ≥12-sentence set is prepared to report mean ± standard deviation.</w:t>
-      </w:r>
-    </w:p>
-    <w:p>
-      <w:pPr>
-        <w:pStyle w:val="Heading1"/>
-      </w:pPr>
-      <w:r>
-        <w:t>10.  Conclusion and Recommendations</w:t>
+        <w:t>These are provisional conclusions reflecting the current project status — an objective benchmark over 7 sentences on the zero-shot base model — not a final, large-scale or fine-tuned evaluation.</w:t>
       </w:r>
     </w:p>
     <w:p>
@@ -2594,10 +2747,10 @@
           <w:b/>
           <w:color w:val="1B4965"/>
         </w:rPr>
-        <w:t xml:space="preserve">Key findings: </w:t>
+        <w:t xml:space="preserve">Key findings (current status): </w:t>
       </w:r>
       <w:r>
-        <w:t>F5-TTS ViVoice is the right primary model: it leads on intelligibility and ranks in the top tier on speaker identity — the only engine to optimize both axes at once. The project also delivers a reproducible objective-evaluation framework that converts subjective impressions into verifiable measurements and surfaced two subtle, high-impact defects.</w:t>
+        <w:t>On this 7-sentence benchmark, the two voice-cloning engines — F5-TTS and XTTS-v2 — are the only systems that reproduce the reference speaker (SECS 0.862 and 0.877, both above the 0.75 threshold), while the fixed-voice engines do not. Intelligibility is comparable across the strong engines: F5-TTS gives the lowest median WER (8.7%) and XTTS-v2 the lowest mean, an effective tie. Just as important as any single winner, the project delivers a reproducible objective-evaluation framework that turns subjective impressions into verifiable measurements and surfaced two subtle, high-impact defects during development.</w:t>
       </w:r>
     </w:p>
     <w:p>
@@ -2612,7 +2765,7 @@
         <w:t xml:space="preserve">Recommendations: </w:t>
       </w:r>
       <w:r>
-        <w:t>Use F5-TTS when both intelligibility and identity matter (enable GPU, raise NFE to 48–64 for long sentences); use XTTS-v2 when identity and speed dominate; use Piper/MMS for real-time offline reading that does not need a specific voice; do not use Bark for Vietnamese. Provide a clean 5–10 s single-speaker reference and an accurate transcript.</w:t>
+        <w:t>For Vietnamese voice cloning, F5-TTS is the recommended primary engine — it matches the field on intelligibility (lowest median WER), reaches top-tier speaker similarity, and is pre-trained on Vietnamese; enable GPU and raise NFE to 48–64 for long sentences. XTTS-v2 is an equally strong, faster alternative when speaker likeness and CPU speed matter most. Use Piper/MMS/Edge for real-time offline reading that does not need a specific voice, and avoid Bark for Vietnamese. Always provide a clean 5–10 s single-speaker reference with an accurate transcript.</w:t>
       </w:r>
     </w:p>
     <w:p>
@@ -2627,7 +2780,45 @@
         <w:t xml:space="preserve">Reflection and future work: </w:t>
       </w:r>
       <w:r>
-        <w:t>The most valuable outcome was establishing an objective yardstick, which made subtle defects visible and keeps future claims evidence-based. Next, in priority order: (1) scale the test set from 1 to ≥12 diverse sentences for mean ± std reporting; (2) collect 30–60 minutes of real speaker audio and run fine-tuning end-to-end on GPU, measuring WER/CER/SECS before vs. after; (3) add subjective MOS listening tests; (4) optimize F5-TTS latency on GPU; (5) package the system (Docker / Hugging Face Spaces) for setup-free demos.</w:t>
+        <w:t>Establishing an objective yardstick was the most valuable outcome: it made subtle defects visible and keeps every claim evidence-based. Next, in priority order: (1) enlarge and balance the test set and report confidence intervals / significance; (2) collect 30–60 minutes of real speaker audio and run fine-tuning end-to-end on GPU, measuring WER/CER/SECS before vs. after; (3) add subjective MOS listening tests; (4) optimize cloning-engine latency on GPU; (5) package the system for setup-free demos.</w:t>
+      </w:r>
+    </w:p>
+    <w:p>
+      <w:pPr>
+        <w:pStyle w:val="Heading1"/>
+      </w:pPr>
+      <w:r>
+        <w:t>11.  License and Ethical Considerations</w:t>
+      </w:r>
+    </w:p>
+    <w:p>
+      <w:pPr>
+        <w:jc w:val="both"/>
+      </w:pPr>
+      <w:r>
+        <w:rPr>
+          <w:b/>
+          <w:color w:val="1B4965"/>
+        </w:rPr>
+        <w:t xml:space="preserve">License: </w:t>
+      </w:r>
+      <w:r>
+        <w:t>The base model hynt/F5-TTS-Vietnamese-ViVoice is released under CC-BY-NC-SA-4.0: this project is strictly non-commercial and for education/research only. Any commercial use would require replacing the model with an appropriately licensed one. Comparison engines retain their own licenses (e.g., Coqui, Meta MMS, Piper, Bark) and Edge-TTS is a cloud service subject to Microsoft's terms.</w:t>
+      </w:r>
+    </w:p>
+    <w:p>
+      <w:pPr>
+        <w:jc w:val="both"/>
+      </w:pPr>
+      <w:r>
+        <w:rPr>
+          <w:b/>
+          <w:color w:val="1B4965"/>
+        </w:rPr>
+        <w:t xml:space="preserve">Ethics: </w:t>
+      </w:r>
+      <w:r>
+        <w:t>Voice cloning can be misused for impersonation. Users must clone only their own voice or a voice they have explicit permission to use; generated audio should be disclosed as synthetic where appropriate. Objective similarity scores here are for quality assessment only and must not be treated as identity verification.</w:t>
       </w:r>
     </w:p>
     <w:p>
@@ -2872,7 +3063,7 @@
           <w:rFonts w:ascii="Consolas" w:hAnsi="Consolas"/>
           <w:sz w:val="19"/>
         </w:rPr>
-        <w:t># 1. Evaluate generated audio → results.json + report.md</w:t>
+        <w:t># 1. Generate audio for all engines over the multi-sentence test set (CPU)</w:t>
       </w:r>
     </w:p>
     <w:p>
@@ -2884,7 +3075,7 @@
           <w:rFonts w:ascii="Consolas" w:hAnsi="Consolas"/>
           <w:sz w:val="19"/>
         </w:rPr>
-        <w:t>python scripts/evaluate.py --manifest evaluation/audit_existing_outputs.json \</w:t>
+        <w:t>python scripts/run_benchmark.py</w:t>
       </w:r>
     </w:p>
     <w:p>
@@ -2896,7 +3087,7 @@
           <w:rFonts w:ascii="Consolas" w:hAnsi="Consolas"/>
           <w:sz w:val="19"/>
         </w:rPr>
-        <w:t xml:space="preserve">    --output-dir outputs/evaluation</w:t>
+        <w:t># 2. Evaluate: WER/CER (Whisper) + speaker similarity (Resemblyzer) + RTF</w:t>
       </w:r>
     </w:p>
     <w:p>
@@ -2908,7 +3099,7 @@
           <w:rFonts w:ascii="Consolas" w:hAnsi="Consolas"/>
           <w:sz w:val="19"/>
         </w:rPr>
-        <w:t># 2. Render the figures (English labels)</w:t>
+        <w:t>python scripts/evaluate.py --manifest outputs/benchmark/manifest.json \</w:t>
       </w:r>
     </w:p>
     <w:p>
@@ -2920,7 +3111,7 @@
           <w:rFonts w:ascii="Consolas" w:hAnsi="Consolas"/>
           <w:sz w:val="19"/>
         </w:rPr>
-        <w:t>python scripts/plot_results.py --lang en --output-dir outputs/evaluation/figures_en</w:t>
+        <w:t xml:space="preserve">    --output-dir outputs/benchmark/evaluation</w:t>
       </w:r>
     </w:p>
     <w:p>
@@ -2932,7 +3123,43 @@
           <w:rFonts w:ascii="Consolas" w:hAnsi="Consolas"/>
           <w:sz w:val="19"/>
         </w:rPr>
-        <w:t># 3. Rebuild this document</w:t>
+        <w:t># 3. Render the figures (English labels, mean ± std)</w:t>
+      </w:r>
+    </w:p>
+    <w:p>
+      <w:pPr>
+        <w:spacing w:after="0"/>
+      </w:pPr>
+      <w:r>
+        <w:rPr>
+          <w:rFonts w:ascii="Consolas" w:hAnsi="Consolas"/>
+          <w:sz w:val="19"/>
+        </w:rPr>
+        <w:t>python scripts/plot_results.py --results outputs/benchmark/evaluation/results.json \</w:t>
+      </w:r>
+    </w:p>
+    <w:p>
+      <w:pPr>
+        <w:spacing w:after="0"/>
+      </w:pPr>
+      <w:r>
+        <w:rPr>
+          <w:rFonts w:ascii="Consolas" w:hAnsi="Consolas"/>
+          <w:sz w:val="19"/>
+        </w:rPr>
+        <w:t xml:space="preserve">    --output-dir outputs/benchmark/figures_en --lang en</w:t>
+      </w:r>
+    </w:p>
+    <w:p>
+      <w:pPr>
+        <w:spacing w:after="0"/>
+      </w:pPr>
+      <w:r>
+        <w:rPr>
+          <w:rFonts w:ascii="Consolas" w:hAnsi="Consolas"/>
+          <w:sz w:val="19"/>
+        </w:rPr>
+        <w:t># 4. Rebuild this document</w:t>
       </w:r>
     </w:p>
     <w:p>

</xml_diff>